<commit_message>
Report: correct degree title, references to end, blank hardware results
</commit_message>
<xml_diff>
--- a/Smart_Odour_PSM_Full_Report.docx
+++ b/Smart_Odour_PSM_Full_Report.docx
@@ -124,7 +124,7 @@
           <w:sz w:val="22"/>
           <w:szCs w:val="22"/>
         </w:rPr>
-        <w:t xml:space="preserve">Bachelor of Computer Science with Honours</w:t>
+        <w:t xml:space="preserve">Bachelor of Cloud Computing and Applications with Honours</w:t>
       </w:r>
     </w:p>
     <w:p>
@@ -4416,726 +4416,6 @@
       </w:r>
     </w:p>
     <w:p>
-      <w:pPr>
-        <w:pStyle w:val="Heading1"/>
-        <w:spacing w:after="260" w:before="400"/>
-      </w:pPr>
-      <w:r>
-        <w:rPr>
-          <w:rFonts w:ascii="Times New Roman" w:cs="Times New Roman" w:eastAsia="Times New Roman" w:hAnsi="Times New Roman"/>
-          <w:b/>
-          <w:bCs/>
-          <w:sz w:val="32"/>
-          <w:szCs w:val="32"/>
-        </w:rPr>
-        <w:t xml:space="preserve">REFERENCES</w:t>
-      </w:r>
-    </w:p>
-    <w:p>
-      <w:pPr>
-        <w:spacing w:after="200" w:line="360"/>
-        <w:jc w:val="both"/>
-      </w:pPr>
-      <w:r>
-        <w:rPr>
-          <w:rFonts w:ascii="Times New Roman" w:cs="Times New Roman" w:eastAsia="Times New Roman" w:hAnsi="Times New Roman"/>
-          <w:color w:val="5A5A5A"/>
-          <w:sz w:val="21"/>
-          <w:szCs w:val="21"/>
-        </w:rPr>
-        <w:t xml:space="preserve">The following sources were reviewed. Author names and full pagination should be completed from the publisher record before submission.</w:t>
-      </w:r>
-    </w:p>
-    <w:p>
-      <w:pPr>
-        <w:pStyle w:val="Heading3"/>
-        <w:spacing w:after="140" w:before="260"/>
-      </w:pPr>
-      <w:r>
-        <w:rPr>
-          <w:rFonts w:ascii="Times New Roman" w:cs="Times New Roman" w:eastAsia="Times New Roman" w:hAnsi="Times New Roman"/>
-          <w:b/>
-          <w:bCs/>
-          <w:sz w:val="24"/>
-          <w:szCs w:val="24"/>
-        </w:rPr>
-        <w:t xml:space="preserve">Poultry and agricultural environmental monitoring</w:t>
-      </w:r>
-    </w:p>
-    <w:p>
-      <w:pPr>
-        <w:spacing w:after="140" w:line="300"/>
-        <w:ind w:left="480" w:hanging="480"/>
-        <w:jc w:val="both"/>
-      </w:pPr>
-      <w:r>
-        <w:rPr>
-          <w:rFonts w:ascii="Times New Roman" w:cs="Times New Roman" w:eastAsia="Times New Roman" w:hAnsi="Times New Roman"/>
-          <w:sz w:val="22"/>
-          <w:szCs w:val="22"/>
-        </w:rPr>
-        <w:t xml:space="preserve">Ammonia &amp; CO2 Gas Detection of Poultry Farms and Compost Plants by Low-Cost Smart Sensing System. 9th International Conference on Signal Processing and Intelligent Systems (ICSPIS), 2023.</w:t>
-      </w:r>
-    </w:p>
-    <w:p>
-      <w:pPr>
-        <w:spacing w:after="140" w:line="300"/>
-        <w:ind w:left="480" w:hanging="480"/>
-        <w:jc w:val="both"/>
-      </w:pPr>
-      <w:r>
-        <w:rPr>
-          <w:rFonts w:ascii="Times New Roman" w:cs="Times New Roman" w:eastAsia="Times New Roman" w:hAnsi="Times New Roman"/>
-          <w:sz w:val="22"/>
-          <w:szCs w:val="22"/>
-        </w:rPr>
-        <w:t xml:space="preserve">An IoT and Machine Learning Approach for Predicting Air Quality Parameters in Poultry Houses. Journal of Biosystems Engineering, vol. 51, 2026.</w:t>
-      </w:r>
-    </w:p>
-    <w:p>
-      <w:pPr>
-        <w:spacing w:after="140" w:line="300"/>
-        <w:ind w:left="480" w:hanging="480"/>
-        <w:jc w:val="both"/>
-      </w:pPr>
-      <w:r>
-        <w:rPr>
-          <w:rFonts w:ascii="Times New Roman" w:cs="Times New Roman" w:eastAsia="Times New Roman" w:hAnsi="Times New Roman"/>
-          <w:sz w:val="22"/>
-          <w:szCs w:val="22"/>
-        </w:rPr>
-        <w:t xml:space="preserve">AIoT-Based Anomaly Detection and Monitoring System for Smart Poultry Farms. International Conference on Intelligent &amp; Innovative Practices in Engineering &amp; Management (IIPEM), 2026.</w:t>
-      </w:r>
-    </w:p>
-    <w:p>
-      <w:pPr>
-        <w:spacing w:after="140" w:line="300"/>
-        <w:ind w:left="480" w:hanging="480"/>
-        <w:jc w:val="both"/>
-      </w:pPr>
-      <w:r>
-        <w:rPr>
-          <w:rFonts w:ascii="Times New Roman" w:cs="Times New Roman" w:eastAsia="Times New Roman" w:hAnsi="Times New Roman"/>
-          <w:sz w:val="22"/>
-          <w:szCs w:val="22"/>
-        </w:rPr>
-        <w:t xml:space="preserve">Design and Prototype Development of a Dual-MCU Wireless IoT System for Multi-Gas Air Quality Monitoring in Poultry Environments. International Conference on Artificial Intelligence and Data Engineering (AIDE), 2026.</w:t>
-      </w:r>
-    </w:p>
-    <w:p>
-      <w:pPr>
-        <w:spacing w:after="140" w:line="300"/>
-        <w:ind w:left="480" w:hanging="480"/>
-        <w:jc w:val="both"/>
-      </w:pPr>
-      <w:r>
-        <w:rPr>
-          <w:rFonts w:ascii="Times New Roman" w:cs="Times New Roman" w:eastAsia="Times New Roman" w:hAnsi="Times New Roman"/>
-          <w:sz w:val="22"/>
-          <w:szCs w:val="22"/>
-        </w:rPr>
-        <w:t xml:space="preserve">Cloud-Based IoT Solution for Enhanced Poultry Farm Management. 4th International Conference on Innovative Practices in Technology and Management (ICIPTM), 2024.</w:t>
-      </w:r>
-    </w:p>
-    <w:p>
-      <w:pPr>
-        <w:spacing w:after="140" w:line="300"/>
-        <w:ind w:left="480" w:hanging="480"/>
-        <w:jc w:val="both"/>
-      </w:pPr>
-      <w:r>
-        <w:rPr>
-          <w:rFonts w:ascii="Times New Roman" w:cs="Times New Roman" w:eastAsia="Times New Roman" w:hAnsi="Times New Roman"/>
-          <w:sz w:val="22"/>
-          <w:szCs w:val="22"/>
-        </w:rPr>
-        <w:t xml:space="preserve">Cloud IoT based Poultry Environment Analysis System. International Conference on Current Research in Artificial Intelligence and Data Science (ICCRAIDS), 2026.</w:t>
-      </w:r>
-    </w:p>
-    <w:p>
-      <w:pPr>
-        <w:spacing w:after="140" w:line="300"/>
-        <w:ind w:left="480" w:hanging="480"/>
-        <w:jc w:val="both"/>
-      </w:pPr>
-      <w:r>
-        <w:rPr>
-          <w:rFonts w:ascii="Times New Roman" w:cs="Times New Roman" w:eastAsia="Times New Roman" w:hAnsi="Times New Roman"/>
-          <w:sz w:val="22"/>
-          <w:szCs w:val="22"/>
-        </w:rPr>
-        <w:t xml:space="preserve">Assessment of Conceptual Framework for Monitoring Poultry Farm’s Temperature and Humidity. IEEE 11th International Conference on System Engineering and Technology (ICSET), 2021.</w:t>
-      </w:r>
-    </w:p>
-    <w:p>
-      <w:pPr>
-        <w:spacing w:after="140" w:line="300"/>
-        <w:ind w:left="480" w:hanging="480"/>
-        <w:jc w:val="both"/>
-      </w:pPr>
-      <w:r>
-        <w:rPr>
-          <w:rFonts w:ascii="Times New Roman" w:cs="Times New Roman" w:eastAsia="Times New Roman" w:hAnsi="Times New Roman"/>
-          <w:sz w:val="22"/>
-          <w:szCs w:val="22"/>
-        </w:rPr>
-        <w:t xml:space="preserve">Integration of Wireless Sensor Network and IoT for Enhanced Broiler Closed-House Monitoring. IEEE 15th Control and System Graduate Research Colloquium (ICSGRC), 2024.</w:t>
-      </w:r>
-    </w:p>
-    <w:p>
-      <w:pPr>
-        <w:spacing w:after="140" w:line="300"/>
-        <w:ind w:left="480" w:hanging="480"/>
-        <w:jc w:val="both"/>
-      </w:pPr>
-      <w:r>
-        <w:rPr>
-          <w:rFonts w:ascii="Times New Roman" w:cs="Times New Roman" w:eastAsia="Times New Roman" w:hAnsi="Times New Roman"/>
-          <w:sz w:val="22"/>
-          <w:szCs w:val="22"/>
-        </w:rPr>
-        <w:t xml:space="preserve">Engineering Framework for Smart Poultry Farming Using Internet of Things. International Journal on Recent and Innovation Trends in Computing and Communication, 2024.</w:t>
-      </w:r>
-    </w:p>
-    <w:p>
-      <w:pPr>
-        <w:spacing w:after="140" w:line="300"/>
-        <w:ind w:left="480" w:hanging="480"/>
-        <w:jc w:val="both"/>
-      </w:pPr>
-      <w:r>
-        <w:rPr>
-          <w:rFonts w:ascii="Times New Roman" w:cs="Times New Roman" w:eastAsia="Times New Roman" w:hAnsi="Times New Roman"/>
-          <w:sz w:val="22"/>
-          <w:szCs w:val="22"/>
-        </w:rPr>
-        <w:t xml:space="preserve">Advancing Precision Livestock Farming: Integrating Hybrid AI, IoT, Cloud and Edge Computing for Enhanced Welfare. IEEE International Conference on Robotics and Technologies for Industrial Automation (ROBOTHIA), 2025.</w:t>
-      </w:r>
-    </w:p>
-    <w:p>
-      <w:pPr>
-        <w:spacing w:after="140" w:line="300"/>
-        <w:ind w:left="480" w:hanging="480"/>
-        <w:jc w:val="both"/>
-      </w:pPr>
-      <w:r>
-        <w:rPr>
-          <w:rFonts w:ascii="Times New Roman" w:cs="Times New Roman" w:eastAsia="Times New Roman" w:hAnsi="Times New Roman"/>
-          <w:sz w:val="22"/>
-          <w:szCs w:val="22"/>
-        </w:rPr>
-        <w:t xml:space="preserve">IoT-based Dynamic Poultry Stress Monitoring and Smart Environmental Control System. 2026.</w:t>
-      </w:r>
-    </w:p>
-    <w:p>
-      <w:pPr>
-        <w:spacing w:after="140" w:line="300"/>
-        <w:ind w:left="480" w:hanging="480"/>
-        <w:jc w:val="both"/>
-      </w:pPr>
-      <w:r>
-        <w:rPr>
-          <w:rFonts w:ascii="Times New Roman" w:cs="Times New Roman" w:eastAsia="Times New Roman" w:hAnsi="Times New Roman"/>
-          <w:sz w:val="22"/>
-          <w:szCs w:val="22"/>
-        </w:rPr>
-        <w:t xml:space="preserve">Poultry-Edge-AI-IoT System for Real-Time Monitoring and Predicting by Using Artificial Intelligence. International Journal of Interactive Mobile Technologies (iJIM), vol. 17, no. 12, 2023.</w:t>
-      </w:r>
-    </w:p>
-    <w:p>
-      <w:pPr>
-        <w:spacing w:after="140" w:line="300"/>
-        <w:ind w:left="480" w:hanging="480"/>
-        <w:jc w:val="both"/>
-      </w:pPr>
-      <w:r>
-        <w:rPr>
-          <w:rFonts w:ascii="Times New Roman" w:cs="Times New Roman" w:eastAsia="Times New Roman" w:hAnsi="Times New Roman"/>
-          <w:sz w:val="22"/>
-          <w:szCs w:val="22"/>
-        </w:rPr>
-        <w:t xml:space="preserve">Smart Poultry Farm: An IoT-based Environmental Monitoring and Control System. 2023.</w:t>
-      </w:r>
-    </w:p>
-    <w:p>
-      <w:pPr>
-        <w:spacing w:after="140" w:line="300"/>
-        <w:ind w:left="480" w:hanging="480"/>
-        <w:jc w:val="both"/>
-      </w:pPr>
-      <w:r>
-        <w:rPr>
-          <w:rFonts w:ascii="Times New Roman" w:cs="Times New Roman" w:eastAsia="Times New Roman" w:hAnsi="Times New Roman"/>
-          <w:sz w:val="22"/>
-          <w:szCs w:val="22"/>
-        </w:rPr>
-        <w:t xml:space="preserve">The Efficiency in Controlling and Monitoring a Poultry Farm based on Internet of Things (IoT). 2024.</w:t>
-      </w:r>
-    </w:p>
-    <w:p>
-      <w:pPr>
-        <w:spacing w:after="140" w:line="300"/>
-        <w:ind w:left="480" w:hanging="480"/>
-        <w:jc w:val="both"/>
-      </w:pPr>
-      <w:r>
-        <w:rPr>
-          <w:rFonts w:ascii="Times New Roman" w:cs="Times New Roman" w:eastAsia="Times New Roman" w:hAnsi="Times New Roman"/>
-          <w:sz w:val="22"/>
-          <w:szCs w:val="22"/>
-        </w:rPr>
-        <w:t xml:space="preserve">Enhancing Poultry Farm Productivity Using IoT-Based Smart Farming Automation System. 2025.</w:t>
-      </w:r>
-    </w:p>
-    <w:p>
-      <w:pPr>
-        <w:spacing w:after="140" w:line="300"/>
-        <w:ind w:left="480" w:hanging="480"/>
-        <w:jc w:val="both"/>
-      </w:pPr>
-      <w:r>
-        <w:rPr>
-          <w:rFonts w:ascii="Times New Roman" w:cs="Times New Roman" w:eastAsia="Times New Roman" w:hAnsi="Times New Roman"/>
-          <w:sz w:val="22"/>
-          <w:szCs w:val="22"/>
-        </w:rPr>
-        <w:t xml:space="preserve">Development of an IoT-Based System with AI-Driven Robotic Feeder and Rice Hull Management for Chickens. 2025.</w:t>
-      </w:r>
-    </w:p>
-    <w:p>
-      <w:pPr>
-        <w:spacing w:after="140" w:line="300"/>
-        <w:ind w:left="480" w:hanging="480"/>
-        <w:jc w:val="both"/>
-      </w:pPr>
-      <w:r>
-        <w:rPr>
-          <w:rFonts w:ascii="Times New Roman" w:cs="Times New Roman" w:eastAsia="Times New Roman" w:hAnsi="Times New Roman"/>
-          <w:sz w:val="22"/>
-          <w:szCs w:val="22"/>
-        </w:rPr>
-        <w:t xml:space="preserve">Intelligent IoT Poultry System for Automated Feed and Environmental Monitoring. 2025.</w:t>
-      </w:r>
-    </w:p>
-    <w:p>
-      <w:pPr>
-        <w:spacing w:after="140" w:line="300"/>
-        <w:ind w:left="480" w:hanging="480"/>
-        <w:jc w:val="both"/>
-      </w:pPr>
-      <w:r>
-        <w:rPr>
-          <w:rFonts w:ascii="Times New Roman" w:cs="Times New Roman" w:eastAsia="Times New Roman" w:hAnsi="Times New Roman"/>
-          <w:sz w:val="22"/>
-          <w:szCs w:val="22"/>
-        </w:rPr>
-        <w:t xml:space="preserve">An IoT-Based System for Measuring Diurnal Gas Emissions. 2025.</w:t>
-      </w:r>
-    </w:p>
-    <w:p>
-      <w:pPr>
-        <w:spacing w:after="140" w:line="300"/>
-        <w:ind w:left="480" w:hanging="480"/>
-        <w:jc w:val="both"/>
-      </w:pPr>
-      <w:r>
-        <w:rPr>
-          <w:rFonts w:ascii="Times New Roman" w:cs="Times New Roman" w:eastAsia="Times New Roman" w:hAnsi="Times New Roman"/>
-          <w:sz w:val="22"/>
-          <w:szCs w:val="22"/>
-        </w:rPr>
-        <w:t xml:space="preserve">Proposing A Cloud and Edge Computing Based Decision Supportive Consolidated Farming System. International Conference on Emerging Smart Computing and Informatics (ESCI), 2026.</w:t>
-      </w:r>
-    </w:p>
-    <w:p>
-      <w:pPr>
-        <w:spacing w:after="140" w:line="300"/>
-        <w:ind w:left="480" w:hanging="480"/>
-        <w:jc w:val="both"/>
-      </w:pPr>
-      <w:r>
-        <w:rPr>
-          <w:rFonts w:ascii="Times New Roman" w:cs="Times New Roman" w:eastAsia="Times New Roman" w:hAnsi="Times New Roman"/>
-          <w:sz w:val="22"/>
-          <w:szCs w:val="22"/>
-        </w:rPr>
-        <w:t xml:space="preserve">5G Enabled Agriculture Ecosystem: Food Supply Chain, Rural Development, and Climate Resilience. 2026.</w:t>
-      </w:r>
-    </w:p>
-    <w:p>
-      <w:pPr>
-        <w:pStyle w:val="Heading3"/>
-        <w:spacing w:after="140" w:before="260"/>
-      </w:pPr>
-      <w:r>
-        <w:rPr>
-          <w:rFonts w:ascii="Times New Roman" w:cs="Times New Roman" w:eastAsia="Times New Roman" w:hAnsi="Times New Roman"/>
-          <w:b/>
-          <w:bCs/>
-          <w:sz w:val="24"/>
-          <w:szCs w:val="24"/>
-        </w:rPr>
-        <w:t xml:space="preserve">Edge, fog and serverless computing</w:t>
-      </w:r>
-    </w:p>
-    <w:p>
-      <w:pPr>
-        <w:spacing w:after="140" w:line="300"/>
-        <w:ind w:left="480" w:hanging="480"/>
-        <w:jc w:val="both"/>
-      </w:pPr>
-      <w:r>
-        <w:rPr>
-          <w:rFonts w:ascii="Times New Roman" w:cs="Times New Roman" w:eastAsia="Times New Roman" w:hAnsi="Times New Roman"/>
-          <w:sz w:val="22"/>
-          <w:szCs w:val="22"/>
-        </w:rPr>
-        <w:t xml:space="preserve">The computing continuum: Past, present, and future. Computer Science Review, vol. 58, 2025.</w:t>
-      </w:r>
-    </w:p>
-    <w:p>
-      <w:pPr>
-        <w:spacing w:after="140" w:line="300"/>
-        <w:ind w:left="480" w:hanging="480"/>
-        <w:jc w:val="both"/>
-      </w:pPr>
-      <w:r>
-        <w:rPr>
-          <w:rFonts w:ascii="Times New Roman" w:cs="Times New Roman" w:eastAsia="Times New Roman" w:hAnsi="Times New Roman"/>
-          <w:sz w:val="22"/>
-          <w:szCs w:val="22"/>
-        </w:rPr>
-        <w:t xml:space="preserve">Contemporary advances in multi-access edge computing: A survey of fundamentals, architecture, technologies. Journal of Network and Computer Applications, vol. 248, 2026.</w:t>
-      </w:r>
-    </w:p>
-    <w:p>
-      <w:pPr>
-        <w:spacing w:after="140" w:line="300"/>
-        <w:ind w:left="480" w:hanging="480"/>
-        <w:jc w:val="both"/>
-      </w:pPr>
-      <w:r>
-        <w:rPr>
-          <w:rFonts w:ascii="Times New Roman" w:cs="Times New Roman" w:eastAsia="Times New Roman" w:hAnsi="Times New Roman"/>
-          <w:sz w:val="22"/>
-          <w:szCs w:val="22"/>
-        </w:rPr>
-        <w:t xml:space="preserve">Microservices and serverless functions — lifecycle, performance, and resource utilisation of edge based systems. Future Generation Computer Systems, vol. 150, 2024.</w:t>
-      </w:r>
-    </w:p>
-    <w:p>
-      <w:pPr>
-        <w:spacing w:after="140" w:line="300"/>
-        <w:ind w:left="480" w:hanging="480"/>
-        <w:jc w:val="both"/>
-      </w:pPr>
-      <w:r>
-        <w:rPr>
-          <w:rFonts w:ascii="Times New Roman" w:cs="Times New Roman" w:eastAsia="Times New Roman" w:hAnsi="Times New Roman"/>
-          <w:sz w:val="22"/>
-          <w:szCs w:val="22"/>
-        </w:rPr>
-        <w:t xml:space="preserve">Expanding the cloud-to-edge continuum to the IoT in serverless federated learning. Future Generation Computer Systems, vol. 155, 2024.</w:t>
-      </w:r>
-    </w:p>
-    <w:p>
-      <w:pPr>
-        <w:spacing w:after="140" w:line="300"/>
-        <w:ind w:left="480" w:hanging="480"/>
-        <w:jc w:val="both"/>
-      </w:pPr>
-      <w:r>
-        <w:rPr>
-          <w:rFonts w:ascii="Times New Roman" w:cs="Times New Roman" w:eastAsia="Times New Roman" w:hAnsi="Times New Roman"/>
-          <w:sz w:val="22"/>
-          <w:szCs w:val="22"/>
-        </w:rPr>
-        <w:t xml:space="preserve">AI augmented Edge and Fog computing: Trends and challenges. Journal of Network and Computer Applications, vol. 216, 2023.</w:t>
-      </w:r>
-    </w:p>
-    <w:p>
-      <w:pPr>
-        <w:spacing w:after="140" w:line="300"/>
-        <w:ind w:left="480" w:hanging="480"/>
-        <w:jc w:val="both"/>
-      </w:pPr>
-      <w:r>
-        <w:rPr>
-          <w:rFonts w:ascii="Times New Roman" w:cs="Times New Roman" w:eastAsia="Times New Roman" w:hAnsi="Times New Roman"/>
-          <w:sz w:val="22"/>
-          <w:szCs w:val="22"/>
-        </w:rPr>
-        <w:t xml:space="preserve">Edge-AI empowered Cyber-Physical Systems: A comprehensive review on performance analysis. Computer Science Review, vol. 58, 2025.</w:t>
-      </w:r>
-    </w:p>
-    <w:p>
-      <w:pPr>
-        <w:spacing w:after="140" w:line="300"/>
-        <w:ind w:left="480" w:hanging="480"/>
-        <w:jc w:val="both"/>
-      </w:pPr>
-      <w:r>
-        <w:rPr>
-          <w:rFonts w:ascii="Times New Roman" w:cs="Times New Roman" w:eastAsia="Times New Roman" w:hAnsi="Times New Roman"/>
-          <w:sz w:val="22"/>
-          <w:szCs w:val="22"/>
-        </w:rPr>
-        <w:t xml:space="preserve">Revisiting workflow scheduling with the power of edge computing: Taxonomy, review, and open challenges. Computer Science Review, vol. 60, 2026.</w:t>
-      </w:r>
-    </w:p>
-    <w:p>
-      <w:pPr>
-        <w:spacing w:after="140" w:line="300"/>
-        <w:ind w:left="480" w:hanging="480"/>
-        <w:jc w:val="both"/>
-      </w:pPr>
-      <w:r>
-        <w:rPr>
-          <w:rFonts w:ascii="Times New Roman" w:cs="Times New Roman" w:eastAsia="Times New Roman" w:hAnsi="Times New Roman"/>
-          <w:sz w:val="22"/>
-          <w:szCs w:val="22"/>
-        </w:rPr>
-        <w:t xml:space="preserve">Edge or Cloud Architecture: The Applicability of New Data Processing. 2025.</w:t>
-      </w:r>
-    </w:p>
-    <w:p>
-      <w:pPr>
-        <w:spacing w:after="140" w:line="300"/>
-        <w:ind w:left="480" w:hanging="480"/>
-        <w:jc w:val="both"/>
-      </w:pPr>
-      <w:r>
-        <w:rPr>
-          <w:rFonts w:ascii="Times New Roman" w:cs="Times New Roman" w:eastAsia="Times New Roman" w:hAnsi="Times New Roman"/>
-          <w:sz w:val="22"/>
-          <w:szCs w:val="22"/>
-        </w:rPr>
-        <w:t xml:space="preserve">Serverless Blockchain-Enabled Architecture for IoT Societal Applications. IEEE, 2020.</w:t>
-      </w:r>
-    </w:p>
-    <w:p>
-      <w:pPr>
-        <w:pStyle w:val="Heading3"/>
-        <w:spacing w:after="140" w:before="260"/>
-      </w:pPr>
-      <w:r>
-        <w:rPr>
-          <w:rFonts w:ascii="Times New Roman" w:cs="Times New Roman" w:eastAsia="Times New Roman" w:hAnsi="Times New Roman"/>
-          <w:b/>
-          <w:bCs/>
-          <w:sz w:val="24"/>
-          <w:szCs w:val="24"/>
-        </w:rPr>
-        <w:t xml:space="preserve">Security, integrity and standards</w:t>
-      </w:r>
-    </w:p>
-    <w:p>
-      <w:pPr>
-        <w:spacing w:after="140" w:line="300"/>
-        <w:ind w:left="480" w:hanging="480"/>
-        <w:jc w:val="both"/>
-      </w:pPr>
-      <w:r>
-        <w:rPr>
-          <w:rFonts w:ascii="Times New Roman" w:cs="Times New Roman" w:eastAsia="Times New Roman" w:hAnsi="Times New Roman"/>
-          <w:sz w:val="22"/>
-          <w:szCs w:val="22"/>
-        </w:rPr>
-        <w:t xml:space="preserve">Exploring the integration of edge computing and blockchain IoT: Principles, architectures, security, and applications. Journal of Network and Computer Applications, vol. 226, 2024.</w:t>
-      </w:r>
-    </w:p>
-    <w:p>
-      <w:pPr>
-        <w:spacing w:after="140" w:line="300"/>
-        <w:ind w:left="480" w:hanging="480"/>
-        <w:jc w:val="both"/>
-      </w:pPr>
-      <w:r>
-        <w:rPr>
-          <w:rFonts w:ascii="Times New Roman" w:cs="Times New Roman" w:eastAsia="Times New Roman" w:hAnsi="Times New Roman"/>
-          <w:sz w:val="22"/>
-          <w:szCs w:val="22"/>
-        </w:rPr>
-        <w:t xml:space="preserve">Security and privacy of industrial big data: Motivation, opportunities, and challenges. Computer Science Review, vol. 58, 2025.</w:t>
-      </w:r>
-    </w:p>
-    <w:p>
-      <w:pPr>
-        <w:spacing w:after="140" w:line="300"/>
-        <w:ind w:left="480" w:hanging="480"/>
-        <w:jc w:val="both"/>
-      </w:pPr>
-      <w:r>
-        <w:rPr>
-          <w:rFonts w:ascii="Times New Roman" w:cs="Times New Roman" w:eastAsia="Times New Roman" w:hAnsi="Times New Roman"/>
-          <w:sz w:val="22"/>
-          <w:szCs w:val="22"/>
-        </w:rPr>
-        <w:t xml:space="preserve">A multi-objectives framework for secure blockchain in fog–cloud network. Future Generation Computer Systems, vol. 155, 2024.</w:t>
-      </w:r>
-    </w:p>
-    <w:p>
-      <w:pPr>
-        <w:spacing w:after="140" w:line="300"/>
-        <w:ind w:left="480" w:hanging="480"/>
-        <w:jc w:val="both"/>
-      </w:pPr>
-      <w:r>
-        <w:rPr>
-          <w:rFonts w:ascii="Times New Roman" w:cs="Times New Roman" w:eastAsia="Times New Roman" w:hAnsi="Times New Roman"/>
-          <w:sz w:val="22"/>
-          <w:szCs w:val="22"/>
-        </w:rPr>
-        <w:t xml:space="preserve">IEEE Std 2796-2024, IEEE Standard for Framework for the Internet of Food (IoF). IEEE, 2024.</w:t>
-      </w:r>
-    </w:p>
-    <w:p>
-      <w:pPr>
-        <w:spacing w:after="140" w:line="300"/>
-        <w:ind w:left="480" w:hanging="480"/>
-        <w:jc w:val="both"/>
-      </w:pPr>
-      <w:r>
-        <w:rPr>
-          <w:rFonts w:ascii="Times New Roman" w:cs="Times New Roman" w:eastAsia="Times New Roman" w:hAnsi="Times New Roman"/>
-          <w:sz w:val="22"/>
-          <w:szCs w:val="22"/>
-        </w:rPr>
-        <w:t xml:space="preserve">IEEE Std 2992-2025, IEEE Recommended Practice for Data Expression, Exchange, and Processing in Smart Agriculture. IEEE, 2025.</w:t>
-      </w:r>
-    </w:p>
-    <w:p>
-      <w:pPr>
-        <w:pStyle w:val="Heading3"/>
-        <w:spacing w:after="140" w:before="260"/>
-      </w:pPr>
-      <w:r>
-        <w:rPr>
-          <w:rFonts w:ascii="Times New Roman" w:cs="Times New Roman" w:eastAsia="Times New Roman" w:hAnsi="Times New Roman"/>
-          <w:b/>
-          <w:bCs/>
-          <w:sz w:val="24"/>
-          <w:szCs w:val="24"/>
-        </w:rPr>
-        <w:t xml:space="preserve">Machine learning and forecasting</w:t>
-      </w:r>
-    </w:p>
-    <w:p>
-      <w:pPr>
-        <w:spacing w:after="140" w:line="300"/>
-        <w:ind w:left="480" w:hanging="480"/>
-        <w:jc w:val="both"/>
-      </w:pPr>
-      <w:r>
-        <w:rPr>
-          <w:rFonts w:ascii="Times New Roman" w:cs="Times New Roman" w:eastAsia="Times New Roman" w:hAnsi="Times New Roman"/>
-          <w:sz w:val="22"/>
-          <w:szCs w:val="22"/>
-        </w:rPr>
-        <w:t xml:space="preserve">A survey on machine learning for streaming time series forecasting. Computer Science Review, vol. 62, 2026.</w:t>
-      </w:r>
-    </w:p>
-    <w:p>
-      <w:pPr>
-        <w:spacing w:after="140" w:line="300"/>
-        <w:ind w:left="480" w:hanging="480"/>
-        <w:jc w:val="both"/>
-      </w:pPr>
-      <w:r>
-        <w:rPr>
-          <w:rFonts w:ascii="Times New Roman" w:cs="Times New Roman" w:eastAsia="Times New Roman" w:hAnsi="Times New Roman"/>
-          <w:sz w:val="22"/>
-          <w:szCs w:val="22"/>
-        </w:rPr>
-        <w:t xml:space="preserve">Explainable AI with SHAP for Data-Driven Growth Prediction in Smart Poultry Farming. 2025.</w:t>
-      </w:r>
-    </w:p>
-    <w:p>
-      <w:pPr>
-        <w:spacing w:after="140" w:line="300"/>
-        <w:ind w:left="480" w:hanging="480"/>
-        <w:jc w:val="both"/>
-      </w:pPr>
-      <w:r>
-        <w:rPr>
-          <w:rFonts w:ascii="Times New Roman" w:cs="Times New Roman" w:eastAsia="Times New Roman" w:hAnsi="Times New Roman"/>
-          <w:sz w:val="22"/>
-          <w:szCs w:val="22"/>
-        </w:rPr>
-        <w:t xml:space="preserve">IoT based Poultry Farm Monitoring System with Deep Learning Techniques. 2026.</w:t>
-      </w:r>
-    </w:p>
-    <w:p>
-      <w:pPr>
-        <w:spacing w:after="140" w:line="300"/>
-        <w:ind w:left="480" w:hanging="480"/>
-        <w:jc w:val="both"/>
-      </w:pPr>
-      <w:r>
-        <w:rPr>
-          <w:rFonts w:ascii="Times New Roman" w:cs="Times New Roman" w:eastAsia="Times New Roman" w:hAnsi="Times New Roman"/>
-          <w:sz w:val="22"/>
-          <w:szCs w:val="22"/>
-        </w:rPr>
-        <w:t xml:space="preserve">Intelligent Control Shed Poultry Farm System Incorporating With Machine Learning. 2024.</w:t>
-      </w:r>
-    </w:p>
-    <w:p>
-      <w:pPr>
-        <w:spacing w:after="140" w:line="300"/>
-        <w:ind w:left="480" w:hanging="480"/>
-        <w:jc w:val="both"/>
-      </w:pPr>
-      <w:r>
-        <w:rPr>
-          <w:rFonts w:ascii="Times New Roman" w:cs="Times New Roman" w:eastAsia="Times New Roman" w:hAnsi="Times New Roman"/>
-          <w:sz w:val="22"/>
-          <w:szCs w:val="22"/>
-        </w:rPr>
-        <w:t xml:space="preserve">Optimizing Poultry Farming Through Environmental Data Analytics Using IoT and ERP Systems. 2026.</w:t>
-      </w:r>
-    </w:p>
-    <w:p>
-      <w:pPr>
-        <w:spacing w:after="140" w:line="300"/>
-        <w:ind w:left="480" w:hanging="480"/>
-        <w:jc w:val="both"/>
-      </w:pPr>
-      <w:r>
-        <w:rPr>
-          <w:rFonts w:ascii="Times New Roman" w:cs="Times New Roman" w:eastAsia="Times New Roman" w:hAnsi="Times New Roman"/>
-          <w:sz w:val="22"/>
-          <w:szCs w:val="22"/>
-        </w:rPr>
-        <w:t xml:space="preserve">Data drift-resilient inference: Maintaining model integrity via lightweight distribution correction. Future Generation Computer Systems, vol. 184, 2026.</w:t>
-      </w:r>
-    </w:p>
-    <w:p>
-      <w:pPr>
-        <w:spacing w:before="300"/>
-      </w:pPr>
-    </w:p>
-    <w:p>
-      <w:pPr>
-        <w:spacing w:after="200" w:line="360"/>
-        <w:jc w:val="both"/>
-      </w:pPr>
-      <w:r>
-        <w:rPr>
-          <w:rFonts w:ascii="Times New Roman" w:cs="Times New Roman" w:eastAsia="Times New Roman" w:hAnsi="Times New Roman"/>
-          <w:color w:val="5A5A5A"/>
-          <w:sz w:val="21"/>
-          <w:szCs w:val="21"/>
-        </w:rPr>
-        <w:t xml:space="preserve">A further 30 sources from the corpus, addressing adjacent topics in IoT architecture, scheduling, networking and smart cities, were examined but are not cited above as they do not bear directly on the design decisions discussed in this chapter. They remain available in the project source collection.</w:t>
-      </w:r>
-    </w:p>
-    <w:p>
-      <w:r>
-        <w:br w:type="page"/>
-      </w:r>
-    </w:p>
-    <w:p>
       <w:r>
         <w:br w:type="page"/>
       </w:r>
@@ -19672,8 +18952,9 @@
           <w:color w:val="000000"/>
           <w:sz w:val="23"/>
           <w:szCs w:val="23"/>
-        </w:rPr>
-        <w:t xml:space="preserve">Hardware tester</w:t>
+          <w:u w:val="single"/>
+        </w:rPr>
+        <w:t xml:space="preserve">               </w:t>
       </w:r>
     </w:p>
     <w:p>
@@ -19734,8 +19015,9 @@
           <w:color w:val="000000"/>
           <w:sz w:val="23"/>
           <w:szCs w:val="23"/>
-        </w:rPr>
-        <w:t xml:space="preserve">Not yet executed; hardware assembly outstanding.</w:t>
+          <w:u w:val="single"/>
+        </w:rPr>
+        <w:t xml:space="preserve">               </w:t>
       </w:r>
     </w:p>
     <w:p>
@@ -19756,52 +19038,6 @@
           <w:szCs w:val="23"/>
         </w:rPr>
         <w:t xml:space="preserve">Status: </w:t>
-      </w:r>
-      <w:r>
-        <w:rPr>
-          <w:rFonts w:ascii="Times New Roman" w:cs="Times New Roman" w:eastAsia="Times New Roman" w:hAnsi="Times New Roman"/>
-          <w:b/>
-          <w:bCs/>
-          <w:color w:val="C00000"/>
-          <w:sz w:val="23"/>
-          <w:szCs w:val="23"/>
-        </w:rPr>
-        <w:t xml:space="preserve">Pending hardware</w:t>
-      </w:r>
-    </w:p>
-    <w:p>
-      <w:pPr>
-        <w:spacing w:after="100" w:before="240"/>
-      </w:pPr>
-      <w:r>
-        <w:rPr>
-          <w:rFonts w:ascii="Times New Roman" w:cs="Times New Roman" w:eastAsia="Times New Roman" w:hAnsi="Times New Roman"/>
-          <w:b/>
-          <w:bCs/>
-          <w:sz w:val="24"/>
-          <w:szCs w:val="24"/>
-        </w:rPr>
-        <w:t xml:space="preserve">27. Test Case ID: TC-FW-03</w:t>
-      </w:r>
-    </w:p>
-    <w:p>
-      <w:pPr>
-        <w:pStyle w:val="ListParagraph"/>
-        <w:numPr>
-          <w:ilvl w:val="0"/>
-          <w:numId w:val="9"/>
-        </w:numPr>
-        <w:spacing w:after="60" w:line="300"/>
-      </w:pPr>
-      <w:r>
-        <w:rPr>
-          <w:rFonts w:ascii="Times New Roman" w:cs="Times New Roman" w:eastAsia="Times New Roman" w:hAnsi="Times New Roman"/>
-          <w:b/>
-          <w:bCs/>
-          <w:sz w:val="23"/>
-          <w:szCs w:val="23"/>
-        </w:rPr>
-        <w:t xml:space="preserve">Module: </w:t>
       </w:r>
       <w:r>
         <w:rPr>
@@ -19811,8 +19047,24 @@
           <w:color w:val="000000"/>
           <w:sz w:val="23"/>
           <w:szCs w:val="23"/>
-        </w:rPr>
-        <w:t xml:space="preserve">Firmware</w:t>
+          <w:u w:val="single"/>
+        </w:rPr>
+        <w:t xml:space="preserve">               </w:t>
+      </w:r>
+    </w:p>
+    <w:p>
+      <w:pPr>
+        <w:spacing w:after="100" w:before="240"/>
+      </w:pPr>
+      <w:r>
+        <w:rPr>
+          <w:rFonts w:ascii="Times New Roman" w:cs="Times New Roman" w:eastAsia="Times New Roman" w:hAnsi="Times New Roman"/>
+          <w:b/>
+          <w:bCs/>
+          <w:sz w:val="24"/>
+          <w:szCs w:val="24"/>
+        </w:rPr>
+        <w:t xml:space="preserve">27. Test Case ID: TC-FW-03</w:t>
       </w:r>
     </w:p>
     <w:p>
@@ -19832,7 +19084,7 @@
           <w:sz w:val="23"/>
           <w:szCs w:val="23"/>
         </w:rPr>
-        <w:t xml:space="preserve">Description: </w:t>
+        <w:t xml:space="preserve">Module: </w:t>
       </w:r>
       <w:r>
         <w:rPr>
@@ -19843,7 +19095,7 @@
           <w:sz w:val="23"/>
           <w:szCs w:val="23"/>
         </w:rPr>
-        <w:t xml:space="preserve">Interrupt connectivity during operation and restore it, verifying buffered readings are replayed without duplication.</w:t>
+        <w:t xml:space="preserve">Firmware</w:t>
       </w:r>
     </w:p>
     <w:p>
@@ -19863,7 +19115,7 @@
           <w:sz w:val="23"/>
           <w:szCs w:val="23"/>
         </w:rPr>
-        <w:t xml:space="preserve">Tester: </w:t>
+        <w:t xml:space="preserve">Description: </w:t>
       </w:r>
       <w:r>
         <w:rPr>
@@ -19874,7 +19126,7 @@
           <w:sz w:val="23"/>
           <w:szCs w:val="23"/>
         </w:rPr>
-        <w:t xml:space="preserve">Hardware tester</w:t>
+        <w:t xml:space="preserve">Interrupt connectivity during operation and restore it, verifying buffered readings are replayed without duplication.</w:t>
       </w:r>
     </w:p>
     <w:p>
@@ -19894,7 +19146,7 @@
           <w:sz w:val="23"/>
           <w:szCs w:val="23"/>
         </w:rPr>
-        <w:t xml:space="preserve">Expected Result: </w:t>
+        <w:t xml:space="preserve">Tester: </w:t>
       </w:r>
       <w:r>
         <w:rPr>
@@ -19904,8 +19156,9 @@
           <w:color w:val="000000"/>
           <w:sz w:val="23"/>
           <w:szCs w:val="23"/>
-        </w:rPr>
-        <w:t xml:space="preserve">Readings queued locally and delivered on reconnection, each retaining its original timestamp.</w:t>
+          <w:u w:val="single"/>
+        </w:rPr>
+        <w:t xml:space="preserve">               </w:t>
       </w:r>
     </w:p>
     <w:p>
@@ -19925,7 +19178,7 @@
           <w:sz w:val="23"/>
           <w:szCs w:val="23"/>
         </w:rPr>
-        <w:t xml:space="preserve">Actual Result: </w:t>
+        <w:t xml:space="preserve">Expected Result: </w:t>
       </w:r>
       <w:r>
         <w:rPr>
@@ -19936,7 +19189,7 @@
           <w:sz w:val="23"/>
           <w:szCs w:val="23"/>
         </w:rPr>
-        <w:t xml:space="preserve">Not yet executed; hardware assembly outstanding.</w:t>
+        <w:t xml:space="preserve">Readings queued locally and delivered on reconnection, each retaining its original timestamp.</w:t>
       </w:r>
     </w:p>
     <w:p>
@@ -19956,53 +19209,7 @@
           <w:sz w:val="23"/>
           <w:szCs w:val="23"/>
         </w:rPr>
-        <w:t xml:space="preserve">Status: </w:t>
-      </w:r>
-      <w:r>
-        <w:rPr>
-          <w:rFonts w:ascii="Times New Roman" w:cs="Times New Roman" w:eastAsia="Times New Roman" w:hAnsi="Times New Roman"/>
-          <w:b/>
-          <w:bCs/>
-          <w:color w:val="C00000"/>
-          <w:sz w:val="23"/>
-          <w:szCs w:val="23"/>
-        </w:rPr>
-        <w:t xml:space="preserve">Pending hardware</w:t>
-      </w:r>
-    </w:p>
-    <w:p>
-      <w:pPr>
-        <w:spacing w:after="100" w:before="240"/>
-      </w:pPr>
-      <w:r>
-        <w:rPr>
-          <w:rFonts w:ascii="Times New Roman" w:cs="Times New Roman" w:eastAsia="Times New Roman" w:hAnsi="Times New Roman"/>
-          <w:b/>
-          <w:bCs/>
-          <w:sz w:val="24"/>
-          <w:szCs w:val="24"/>
-        </w:rPr>
-        <w:t xml:space="preserve">28. Test Case ID: TC-INT-01</w:t>
-      </w:r>
-    </w:p>
-    <w:p>
-      <w:pPr>
-        <w:pStyle w:val="ListParagraph"/>
-        <w:numPr>
-          <w:ilvl w:val="0"/>
-          <w:numId w:val="9"/>
-        </w:numPr>
-        <w:spacing w:after="60" w:line="300"/>
-      </w:pPr>
-      <w:r>
-        <w:rPr>
-          <w:rFonts w:ascii="Times New Roman" w:cs="Times New Roman" w:eastAsia="Times New Roman" w:hAnsi="Times New Roman"/>
-          <w:b/>
-          <w:bCs/>
-          <w:sz w:val="23"/>
-          <w:szCs w:val="23"/>
-        </w:rPr>
-        <w:t xml:space="preserve">Module: </w:t>
+        <w:t xml:space="preserve">Actual Result: </w:t>
       </w:r>
       <w:r>
         <w:rPr>
@@ -20012,8 +19219,9 @@
           <w:color w:val="000000"/>
           <w:sz w:val="23"/>
           <w:szCs w:val="23"/>
-        </w:rPr>
-        <w:t xml:space="preserve">Integration</w:t>
+          <w:u w:val="single"/>
+        </w:rPr>
+        <w:t xml:space="preserve">               </w:t>
       </w:r>
     </w:p>
     <w:p>
@@ -20033,7 +19241,7 @@
           <w:sz w:val="23"/>
           <w:szCs w:val="23"/>
         </w:rPr>
-        <w:t xml:space="preserve">Description: </w:t>
+        <w:t xml:space="preserve">Status: </w:t>
       </w:r>
       <w:r>
         <w:rPr>
@@ -20043,8 +19251,24 @@
           <w:color w:val="000000"/>
           <w:sz w:val="23"/>
           <w:szCs w:val="23"/>
-        </w:rPr>
-        <w:t xml:space="preserve">Execute a forecast across the edge, database and compute services.</w:t>
+          <w:u w:val="single"/>
+        </w:rPr>
+        <w:t xml:space="preserve">               </w:t>
+      </w:r>
+    </w:p>
+    <w:p>
+      <w:pPr>
+        <w:spacing w:after="100" w:before="240"/>
+      </w:pPr>
+      <w:r>
+        <w:rPr>
+          <w:rFonts w:ascii="Times New Roman" w:cs="Times New Roman" w:eastAsia="Times New Roman" w:hAnsi="Times New Roman"/>
+          <w:b/>
+          <w:bCs/>
+          <w:sz w:val="24"/>
+          <w:szCs w:val="24"/>
+        </w:rPr>
+        <w:t xml:space="preserve">28. Test Case ID: TC-INT-01</w:t>
       </w:r>
     </w:p>
     <w:p>
@@ -20064,7 +19288,7 @@
           <w:sz w:val="23"/>
           <w:szCs w:val="23"/>
         </w:rPr>
-        <w:t xml:space="preserve">Tester: </w:t>
+        <w:t xml:space="preserve">Module: </w:t>
       </w:r>
       <w:r>
         <w:rPr>
@@ -20075,7 +19299,7 @@
           <w:sz w:val="23"/>
           <w:szCs w:val="23"/>
         </w:rPr>
-        <w:t xml:space="preserve">Automated suite</w:t>
+        <w:t xml:space="preserve">Integration</w:t>
       </w:r>
     </w:p>
     <w:p>
@@ -20095,7 +19319,7 @@
           <w:sz w:val="23"/>
           <w:szCs w:val="23"/>
         </w:rPr>
-        <w:t xml:space="preserve">Expected Result: </w:t>
+        <w:t xml:space="preserve">Description: </w:t>
       </w:r>
       <w:r>
         <w:rPr>
@@ -20106,7 +19330,7 @@
           <w:sz w:val="23"/>
           <w:szCs w:val="23"/>
         </w:rPr>
-        <w:t xml:space="preserve">Model fitted, predictions written and retrievable.</w:t>
+        <w:t xml:space="preserve">Execute a forecast across the edge, database and compute services.</w:t>
       </w:r>
     </w:p>
     <w:p>
@@ -20126,7 +19350,7 @@
           <w:sz w:val="23"/>
           <w:szCs w:val="23"/>
         </w:rPr>
-        <w:t xml:space="preserve">Actual Result: </w:t>
+        <w:t xml:space="preserve">Tester: </w:t>
       </w:r>
       <w:r>
         <w:rPr>
@@ -20137,7 +19361,7 @@
           <w:sz w:val="23"/>
           <w:szCs w:val="23"/>
         </w:rPr>
-        <w:t xml:space="preserve">Three zones fitted; four forecast horizons stored per zone with uncertainty bounds within the valid range. A zone with insufficient data was refused rather than being given a fabricated forecast.</w:t>
+        <w:t xml:space="preserve">Automated suite</w:t>
       </w:r>
     </w:p>
     <w:p>
@@ -20157,53 +19381,7 @@
           <w:sz w:val="23"/>
           <w:szCs w:val="23"/>
         </w:rPr>
-        <w:t xml:space="preserve">Status: </w:t>
-      </w:r>
-      <w:r>
-        <w:rPr>
-          <w:rFonts w:ascii="Times New Roman" w:cs="Times New Roman" w:eastAsia="Times New Roman" w:hAnsi="Times New Roman"/>
-          <w:b/>
-          <w:bCs/>
-          <w:color w:val="1F7A44"/>
-          <w:sz w:val="23"/>
-          <w:szCs w:val="23"/>
-        </w:rPr>
-        <w:t xml:space="preserve">Pass</w:t>
-      </w:r>
-    </w:p>
-    <w:p>
-      <w:pPr>
-        <w:spacing w:after="100" w:before="240"/>
-      </w:pPr>
-      <w:r>
-        <w:rPr>
-          <w:rFonts w:ascii="Times New Roman" w:cs="Times New Roman" w:eastAsia="Times New Roman" w:hAnsi="Times New Roman"/>
-          <w:b/>
-          <w:bCs/>
-          <w:sz w:val="24"/>
-          <w:szCs w:val="24"/>
-        </w:rPr>
-        <w:t xml:space="preserve">29. Test Case ID: TC-INT-02</w:t>
-      </w:r>
-    </w:p>
-    <w:p>
-      <w:pPr>
-        <w:pStyle w:val="ListParagraph"/>
-        <w:numPr>
-          <w:ilvl w:val="0"/>
-          <w:numId w:val="9"/>
-        </w:numPr>
-        <w:spacing w:after="60" w:line="300"/>
-      </w:pPr>
-      <w:r>
-        <w:rPr>
-          <w:rFonts w:ascii="Times New Roman" w:cs="Times New Roman" w:eastAsia="Times New Roman" w:hAnsi="Times New Roman"/>
-          <w:b/>
-          <w:bCs/>
-          <w:sz w:val="23"/>
-          <w:szCs w:val="23"/>
-        </w:rPr>
-        <w:t xml:space="preserve">Module: </w:t>
+        <w:t xml:space="preserve">Expected Result: </w:t>
       </w:r>
       <w:r>
         <w:rPr>
@@ -20214,7 +19392,7 @@
           <w:sz w:val="23"/>
           <w:szCs w:val="23"/>
         </w:rPr>
-        <w:t xml:space="preserve">Integration</w:t>
+        <w:t xml:space="preserve">Model fitted, predictions written and retrievable.</w:t>
       </w:r>
     </w:p>
     <w:p>
@@ -20234,7 +19412,7 @@
           <w:sz w:val="23"/>
           <w:szCs w:val="23"/>
         </w:rPr>
-        <w:t xml:space="preserve">Description: </w:t>
+        <w:t xml:space="preserve">Actual Result: </w:t>
       </w:r>
       <w:r>
         <w:rPr>
@@ -20245,7 +19423,7 @@
           <w:sz w:val="23"/>
           <w:szCs w:val="23"/>
         </w:rPr>
-        <w:t xml:space="preserve">Generate a compliance report through the full service chain.</w:t>
+        <w:t xml:space="preserve">Three zones fitted; four forecast horizons stored per zone with uncertainty bounds within the valid range. A zone with insufficient data was refused rather than being given a fabricated forecast.</w:t>
       </w:r>
     </w:p>
     <w:p>
@@ -20265,7 +19443,53 @@
           <w:sz w:val="23"/>
           <w:szCs w:val="23"/>
         </w:rPr>
-        <w:t xml:space="preserve">Tester: </w:t>
+        <w:t xml:space="preserve">Status: </w:t>
+      </w:r>
+      <w:r>
+        <w:rPr>
+          <w:rFonts w:ascii="Times New Roman" w:cs="Times New Roman" w:eastAsia="Times New Roman" w:hAnsi="Times New Roman"/>
+          <w:b/>
+          <w:bCs/>
+          <w:color w:val="1F7A44"/>
+          <w:sz w:val="23"/>
+          <w:szCs w:val="23"/>
+        </w:rPr>
+        <w:t xml:space="preserve">Pass</w:t>
+      </w:r>
+    </w:p>
+    <w:p>
+      <w:pPr>
+        <w:spacing w:after="100" w:before="240"/>
+      </w:pPr>
+      <w:r>
+        <w:rPr>
+          <w:rFonts w:ascii="Times New Roman" w:cs="Times New Roman" w:eastAsia="Times New Roman" w:hAnsi="Times New Roman"/>
+          <w:b/>
+          <w:bCs/>
+          <w:sz w:val="24"/>
+          <w:szCs w:val="24"/>
+        </w:rPr>
+        <w:t xml:space="preserve">29. Test Case ID: TC-INT-02</w:t>
+      </w:r>
+    </w:p>
+    <w:p>
+      <w:pPr>
+        <w:pStyle w:val="ListParagraph"/>
+        <w:numPr>
+          <w:ilvl w:val="0"/>
+          <w:numId w:val="9"/>
+        </w:numPr>
+        <w:spacing w:after="60" w:line="300"/>
+      </w:pPr>
+      <w:r>
+        <w:rPr>
+          <w:rFonts w:ascii="Times New Roman" w:cs="Times New Roman" w:eastAsia="Times New Roman" w:hAnsi="Times New Roman"/>
+          <w:b/>
+          <w:bCs/>
+          <w:sz w:val="23"/>
+          <w:szCs w:val="23"/>
+        </w:rPr>
+        <w:t xml:space="preserve">Module: </w:t>
       </w:r>
       <w:r>
         <w:rPr>
@@ -20276,7 +19500,7 @@
           <w:sz w:val="23"/>
           <w:szCs w:val="23"/>
         </w:rPr>
-        <w:t xml:space="preserve">Automated suite</w:t>
+        <w:t xml:space="preserve">Integration</w:t>
       </w:r>
     </w:p>
     <w:p>
@@ -20296,7 +19520,7 @@
           <w:sz w:val="23"/>
           <w:szCs w:val="23"/>
         </w:rPr>
-        <w:t xml:space="preserve">Expected Result: </w:t>
+        <w:t xml:space="preserve">Description: </w:t>
       </w:r>
       <w:r>
         <w:rPr>
@@ -20307,7 +19531,7 @@
           <w:sz w:val="23"/>
           <w:szCs w:val="23"/>
         </w:rPr>
-        <w:t xml:space="preserve">A valid PDF returned and archived.</w:t>
+        <w:t xml:space="preserve">Generate a compliance report through the full service chain.</w:t>
       </w:r>
     </w:p>
     <w:p>
@@ -20327,7 +19551,7 @@
           <w:sz w:val="23"/>
           <w:szCs w:val="23"/>
         </w:rPr>
-        <w:t xml:space="preserve">Actual Result: </w:t>
+        <w:t xml:space="preserve">Tester: </w:t>
       </w:r>
       <w:r>
         <w:rPr>
@@ -20338,6 +19562,68 @@
           <w:sz w:val="23"/>
           <w:szCs w:val="23"/>
         </w:rPr>
+        <w:t xml:space="preserve">Automated suite</w:t>
+      </w:r>
+    </w:p>
+    <w:p>
+      <w:pPr>
+        <w:pStyle w:val="ListParagraph"/>
+        <w:numPr>
+          <w:ilvl w:val="0"/>
+          <w:numId w:val="9"/>
+        </w:numPr>
+        <w:spacing w:after="60" w:line="300"/>
+      </w:pPr>
+      <w:r>
+        <w:rPr>
+          <w:rFonts w:ascii="Times New Roman" w:cs="Times New Roman" w:eastAsia="Times New Roman" w:hAnsi="Times New Roman"/>
+          <w:b/>
+          <w:bCs/>
+          <w:sz w:val="23"/>
+          <w:szCs w:val="23"/>
+        </w:rPr>
+        <w:t xml:space="preserve">Expected Result: </w:t>
+      </w:r>
+      <w:r>
+        <w:rPr>
+          <w:rFonts w:ascii="Times New Roman" w:cs="Times New Roman" w:eastAsia="Times New Roman" w:hAnsi="Times New Roman"/>
+          <w:b w:val="false"/>
+          <w:bCs w:val="false"/>
+          <w:color w:val="000000"/>
+          <w:sz w:val="23"/>
+          <w:szCs w:val="23"/>
+        </w:rPr>
+        <w:t xml:space="preserve">A valid PDF returned and archived.</w:t>
+      </w:r>
+    </w:p>
+    <w:p>
+      <w:pPr>
+        <w:pStyle w:val="ListParagraph"/>
+        <w:numPr>
+          <w:ilvl w:val="0"/>
+          <w:numId w:val="9"/>
+        </w:numPr>
+        <w:spacing w:after="60" w:line="300"/>
+      </w:pPr>
+      <w:r>
+        <w:rPr>
+          <w:rFonts w:ascii="Times New Roman" w:cs="Times New Roman" w:eastAsia="Times New Roman" w:hAnsi="Times New Roman"/>
+          <w:b/>
+          <w:bCs/>
+          <w:sz w:val="23"/>
+          <w:szCs w:val="23"/>
+        </w:rPr>
+        <w:t xml:space="preserve">Actual Result: </w:t>
+      </w:r>
+      <w:r>
+        <w:rPr>
+          <w:rFonts w:ascii="Times New Roman" w:cs="Times New Roman" w:eastAsia="Times New Roman" w:hAnsi="Times New Roman"/>
+          <w:b w:val="false"/>
+          <w:bCs w:val="false"/>
+          <w:color w:val="000000"/>
+          <w:sz w:val="23"/>
+          <w:szCs w:val="23"/>
+        </w:rPr>
         <w:t xml:space="preserve">A valid PDF was produced and its metadata recorded. An unauthenticated request was refused with HTTP 401.</w:t>
       </w:r>
     </w:p>
@@ -20544,7 +19830,7 @@
           <w:sz w:val="24"/>
           <w:szCs w:val="24"/>
         </w:rPr>
-        <w:t xml:space="preserve">Of the test cases presented, 27 passed and 2 remain pending physical hardware assembly. No test case failed at the conclusion of testing. The three defects described in section 6.5.2 were identified during testing, corrected, and confirmed by re-execution of the affected suites.</w:t>
+        <w:t xml:space="preserve">Of the test cases presented, 27 passed. Two cases covering physical hardware, TC-FW-02 and TC-FW-03, are recorded with their result fields left blank pending execution. No test case failed. The three defects described in section 6.5.2 were identified during testing, corrected, and confirmed by re-execution of the affected suites.</w:t>
       </w:r>
     </w:p>
     <w:p>
@@ -21304,6 +20590,726 @@
           <w:szCs w:val="24"/>
         </w:rPr>
         <w:t xml:space="preserve">The limitations recorded in section 7.4 are genuine and are stated deliberately. The most significant is sensor calibration: without it the system reports relative severity rather than concentration, and that constraint should be understood by anyone interpreting its output. Recognising precisely what a measurement can and cannot support is a necessary part of building an instrument, and the platform was designed to report only what its hardware can justify.</w:t>
+      </w:r>
+    </w:p>
+    <w:p>
+      <w:r>
+        <w:br w:type="page"/>
+      </w:r>
+    </w:p>
+    <w:p>
+      <w:pPr>
+        <w:pStyle w:val="Heading1"/>
+        <w:spacing w:after="260" w:before="400"/>
+      </w:pPr>
+      <w:r>
+        <w:rPr>
+          <w:rFonts w:ascii="Times New Roman" w:cs="Times New Roman" w:eastAsia="Times New Roman" w:hAnsi="Times New Roman"/>
+          <w:b/>
+          <w:bCs/>
+          <w:sz w:val="32"/>
+          <w:szCs w:val="32"/>
+        </w:rPr>
+        <w:t xml:space="preserve">REFERENCES</w:t>
+      </w:r>
+    </w:p>
+    <w:p>
+      <w:pPr>
+        <w:spacing w:after="200" w:line="360"/>
+        <w:jc w:val="both"/>
+      </w:pPr>
+      <w:r>
+        <w:rPr>
+          <w:rFonts w:ascii="Times New Roman" w:cs="Times New Roman" w:eastAsia="Times New Roman" w:hAnsi="Times New Roman"/>
+          <w:color w:val="5A5A5A"/>
+          <w:sz w:val="21"/>
+          <w:szCs w:val="21"/>
+        </w:rPr>
+        <w:t xml:space="preserve">The following sources were reviewed. Author names and full pagination should be completed from the publisher record before submission.</w:t>
+      </w:r>
+    </w:p>
+    <w:p>
+      <w:pPr>
+        <w:pStyle w:val="Heading3"/>
+        <w:spacing w:after="140" w:before="260"/>
+      </w:pPr>
+      <w:r>
+        <w:rPr>
+          <w:rFonts w:ascii="Times New Roman" w:cs="Times New Roman" w:eastAsia="Times New Roman" w:hAnsi="Times New Roman"/>
+          <w:b/>
+          <w:bCs/>
+          <w:sz w:val="24"/>
+          <w:szCs w:val="24"/>
+        </w:rPr>
+        <w:t xml:space="preserve">Poultry and agricultural environmental monitoring</w:t>
+      </w:r>
+    </w:p>
+    <w:p>
+      <w:pPr>
+        <w:spacing w:after="140" w:line="300"/>
+        <w:ind w:left="480" w:hanging="480"/>
+        <w:jc w:val="both"/>
+      </w:pPr>
+      <w:r>
+        <w:rPr>
+          <w:rFonts w:ascii="Times New Roman" w:cs="Times New Roman" w:eastAsia="Times New Roman" w:hAnsi="Times New Roman"/>
+          <w:sz w:val="22"/>
+          <w:szCs w:val="22"/>
+        </w:rPr>
+        <w:t xml:space="preserve">Ammonia &amp; CO2 Gas Detection of Poultry Farms and Compost Plants by Low-Cost Smart Sensing System. 9th International Conference on Signal Processing and Intelligent Systems (ICSPIS), 2023.</w:t>
+      </w:r>
+    </w:p>
+    <w:p>
+      <w:pPr>
+        <w:spacing w:after="140" w:line="300"/>
+        <w:ind w:left="480" w:hanging="480"/>
+        <w:jc w:val="both"/>
+      </w:pPr>
+      <w:r>
+        <w:rPr>
+          <w:rFonts w:ascii="Times New Roman" w:cs="Times New Roman" w:eastAsia="Times New Roman" w:hAnsi="Times New Roman"/>
+          <w:sz w:val="22"/>
+          <w:szCs w:val="22"/>
+        </w:rPr>
+        <w:t xml:space="preserve">An IoT and Machine Learning Approach for Predicting Air Quality Parameters in Poultry Houses. Journal of Biosystems Engineering, vol. 51, 2026.</w:t>
+      </w:r>
+    </w:p>
+    <w:p>
+      <w:pPr>
+        <w:spacing w:after="140" w:line="300"/>
+        <w:ind w:left="480" w:hanging="480"/>
+        <w:jc w:val="both"/>
+      </w:pPr>
+      <w:r>
+        <w:rPr>
+          <w:rFonts w:ascii="Times New Roman" w:cs="Times New Roman" w:eastAsia="Times New Roman" w:hAnsi="Times New Roman"/>
+          <w:sz w:val="22"/>
+          <w:szCs w:val="22"/>
+        </w:rPr>
+        <w:t xml:space="preserve">AIoT-Based Anomaly Detection and Monitoring System for Smart Poultry Farms. International Conference on Intelligent &amp; Innovative Practices in Engineering &amp; Management (IIPEM), 2026.</w:t>
+      </w:r>
+    </w:p>
+    <w:p>
+      <w:pPr>
+        <w:spacing w:after="140" w:line="300"/>
+        <w:ind w:left="480" w:hanging="480"/>
+        <w:jc w:val="both"/>
+      </w:pPr>
+      <w:r>
+        <w:rPr>
+          <w:rFonts w:ascii="Times New Roman" w:cs="Times New Roman" w:eastAsia="Times New Roman" w:hAnsi="Times New Roman"/>
+          <w:sz w:val="22"/>
+          <w:szCs w:val="22"/>
+        </w:rPr>
+        <w:t xml:space="preserve">Design and Prototype Development of a Dual-MCU Wireless IoT System for Multi-Gas Air Quality Monitoring in Poultry Environments. International Conference on Artificial Intelligence and Data Engineering (AIDE), 2026.</w:t>
+      </w:r>
+    </w:p>
+    <w:p>
+      <w:pPr>
+        <w:spacing w:after="140" w:line="300"/>
+        <w:ind w:left="480" w:hanging="480"/>
+        <w:jc w:val="both"/>
+      </w:pPr>
+      <w:r>
+        <w:rPr>
+          <w:rFonts w:ascii="Times New Roman" w:cs="Times New Roman" w:eastAsia="Times New Roman" w:hAnsi="Times New Roman"/>
+          <w:sz w:val="22"/>
+          <w:szCs w:val="22"/>
+        </w:rPr>
+        <w:t xml:space="preserve">Cloud-Based IoT Solution for Enhanced Poultry Farm Management. 4th International Conference on Innovative Practices in Technology and Management (ICIPTM), 2024.</w:t>
+      </w:r>
+    </w:p>
+    <w:p>
+      <w:pPr>
+        <w:spacing w:after="140" w:line="300"/>
+        <w:ind w:left="480" w:hanging="480"/>
+        <w:jc w:val="both"/>
+      </w:pPr>
+      <w:r>
+        <w:rPr>
+          <w:rFonts w:ascii="Times New Roman" w:cs="Times New Roman" w:eastAsia="Times New Roman" w:hAnsi="Times New Roman"/>
+          <w:sz w:val="22"/>
+          <w:szCs w:val="22"/>
+        </w:rPr>
+        <w:t xml:space="preserve">Cloud IoT based Poultry Environment Analysis System. International Conference on Current Research in Artificial Intelligence and Data Science (ICCRAIDS), 2026.</w:t>
+      </w:r>
+    </w:p>
+    <w:p>
+      <w:pPr>
+        <w:spacing w:after="140" w:line="300"/>
+        <w:ind w:left="480" w:hanging="480"/>
+        <w:jc w:val="both"/>
+      </w:pPr>
+      <w:r>
+        <w:rPr>
+          <w:rFonts w:ascii="Times New Roman" w:cs="Times New Roman" w:eastAsia="Times New Roman" w:hAnsi="Times New Roman"/>
+          <w:sz w:val="22"/>
+          <w:szCs w:val="22"/>
+        </w:rPr>
+        <w:t xml:space="preserve">Assessment of Conceptual Framework for Monitoring Poultry Farm’s Temperature and Humidity. IEEE 11th International Conference on System Engineering and Technology (ICSET), 2021.</w:t>
+      </w:r>
+    </w:p>
+    <w:p>
+      <w:pPr>
+        <w:spacing w:after="140" w:line="300"/>
+        <w:ind w:left="480" w:hanging="480"/>
+        <w:jc w:val="both"/>
+      </w:pPr>
+      <w:r>
+        <w:rPr>
+          <w:rFonts w:ascii="Times New Roman" w:cs="Times New Roman" w:eastAsia="Times New Roman" w:hAnsi="Times New Roman"/>
+          <w:sz w:val="22"/>
+          <w:szCs w:val="22"/>
+        </w:rPr>
+        <w:t xml:space="preserve">Integration of Wireless Sensor Network and IoT for Enhanced Broiler Closed-House Monitoring. IEEE 15th Control and System Graduate Research Colloquium (ICSGRC), 2024.</w:t>
+      </w:r>
+    </w:p>
+    <w:p>
+      <w:pPr>
+        <w:spacing w:after="140" w:line="300"/>
+        <w:ind w:left="480" w:hanging="480"/>
+        <w:jc w:val="both"/>
+      </w:pPr>
+      <w:r>
+        <w:rPr>
+          <w:rFonts w:ascii="Times New Roman" w:cs="Times New Roman" w:eastAsia="Times New Roman" w:hAnsi="Times New Roman"/>
+          <w:sz w:val="22"/>
+          <w:szCs w:val="22"/>
+        </w:rPr>
+        <w:t xml:space="preserve">Engineering Framework for Smart Poultry Farming Using Internet of Things. International Journal on Recent and Innovation Trends in Computing and Communication, 2024.</w:t>
+      </w:r>
+    </w:p>
+    <w:p>
+      <w:pPr>
+        <w:spacing w:after="140" w:line="300"/>
+        <w:ind w:left="480" w:hanging="480"/>
+        <w:jc w:val="both"/>
+      </w:pPr>
+      <w:r>
+        <w:rPr>
+          <w:rFonts w:ascii="Times New Roman" w:cs="Times New Roman" w:eastAsia="Times New Roman" w:hAnsi="Times New Roman"/>
+          <w:sz w:val="22"/>
+          <w:szCs w:val="22"/>
+        </w:rPr>
+        <w:t xml:space="preserve">Advancing Precision Livestock Farming: Integrating Hybrid AI, IoT, Cloud and Edge Computing for Enhanced Welfare. IEEE International Conference on Robotics and Technologies for Industrial Automation (ROBOTHIA), 2025.</w:t>
+      </w:r>
+    </w:p>
+    <w:p>
+      <w:pPr>
+        <w:spacing w:after="140" w:line="300"/>
+        <w:ind w:left="480" w:hanging="480"/>
+        <w:jc w:val="both"/>
+      </w:pPr>
+      <w:r>
+        <w:rPr>
+          <w:rFonts w:ascii="Times New Roman" w:cs="Times New Roman" w:eastAsia="Times New Roman" w:hAnsi="Times New Roman"/>
+          <w:sz w:val="22"/>
+          <w:szCs w:val="22"/>
+        </w:rPr>
+        <w:t xml:space="preserve">IoT-based Dynamic Poultry Stress Monitoring and Smart Environmental Control System. 2026.</w:t>
+      </w:r>
+    </w:p>
+    <w:p>
+      <w:pPr>
+        <w:spacing w:after="140" w:line="300"/>
+        <w:ind w:left="480" w:hanging="480"/>
+        <w:jc w:val="both"/>
+      </w:pPr>
+      <w:r>
+        <w:rPr>
+          <w:rFonts w:ascii="Times New Roman" w:cs="Times New Roman" w:eastAsia="Times New Roman" w:hAnsi="Times New Roman"/>
+          <w:sz w:val="22"/>
+          <w:szCs w:val="22"/>
+        </w:rPr>
+        <w:t xml:space="preserve">Poultry-Edge-AI-IoT System for Real-Time Monitoring and Predicting by Using Artificial Intelligence. International Journal of Interactive Mobile Technologies (iJIM), vol. 17, no. 12, 2023.</w:t>
+      </w:r>
+    </w:p>
+    <w:p>
+      <w:pPr>
+        <w:spacing w:after="140" w:line="300"/>
+        <w:ind w:left="480" w:hanging="480"/>
+        <w:jc w:val="both"/>
+      </w:pPr>
+      <w:r>
+        <w:rPr>
+          <w:rFonts w:ascii="Times New Roman" w:cs="Times New Roman" w:eastAsia="Times New Roman" w:hAnsi="Times New Roman"/>
+          <w:sz w:val="22"/>
+          <w:szCs w:val="22"/>
+        </w:rPr>
+        <w:t xml:space="preserve">Smart Poultry Farm: An IoT-based Environmental Monitoring and Control System. 2023.</w:t>
+      </w:r>
+    </w:p>
+    <w:p>
+      <w:pPr>
+        <w:spacing w:after="140" w:line="300"/>
+        <w:ind w:left="480" w:hanging="480"/>
+        <w:jc w:val="both"/>
+      </w:pPr>
+      <w:r>
+        <w:rPr>
+          <w:rFonts w:ascii="Times New Roman" w:cs="Times New Roman" w:eastAsia="Times New Roman" w:hAnsi="Times New Roman"/>
+          <w:sz w:val="22"/>
+          <w:szCs w:val="22"/>
+        </w:rPr>
+        <w:t xml:space="preserve">The Efficiency in Controlling and Monitoring a Poultry Farm based on Internet of Things (IoT). 2024.</w:t>
+      </w:r>
+    </w:p>
+    <w:p>
+      <w:pPr>
+        <w:spacing w:after="140" w:line="300"/>
+        <w:ind w:left="480" w:hanging="480"/>
+        <w:jc w:val="both"/>
+      </w:pPr>
+      <w:r>
+        <w:rPr>
+          <w:rFonts w:ascii="Times New Roman" w:cs="Times New Roman" w:eastAsia="Times New Roman" w:hAnsi="Times New Roman"/>
+          <w:sz w:val="22"/>
+          <w:szCs w:val="22"/>
+        </w:rPr>
+        <w:t xml:space="preserve">Enhancing Poultry Farm Productivity Using IoT-Based Smart Farming Automation System. 2025.</w:t>
+      </w:r>
+    </w:p>
+    <w:p>
+      <w:pPr>
+        <w:spacing w:after="140" w:line="300"/>
+        <w:ind w:left="480" w:hanging="480"/>
+        <w:jc w:val="both"/>
+      </w:pPr>
+      <w:r>
+        <w:rPr>
+          <w:rFonts w:ascii="Times New Roman" w:cs="Times New Roman" w:eastAsia="Times New Roman" w:hAnsi="Times New Roman"/>
+          <w:sz w:val="22"/>
+          <w:szCs w:val="22"/>
+        </w:rPr>
+        <w:t xml:space="preserve">Development of an IoT-Based System with AI-Driven Robotic Feeder and Rice Hull Management for Chickens. 2025.</w:t>
+      </w:r>
+    </w:p>
+    <w:p>
+      <w:pPr>
+        <w:spacing w:after="140" w:line="300"/>
+        <w:ind w:left="480" w:hanging="480"/>
+        <w:jc w:val="both"/>
+      </w:pPr>
+      <w:r>
+        <w:rPr>
+          <w:rFonts w:ascii="Times New Roman" w:cs="Times New Roman" w:eastAsia="Times New Roman" w:hAnsi="Times New Roman"/>
+          <w:sz w:val="22"/>
+          <w:szCs w:val="22"/>
+        </w:rPr>
+        <w:t xml:space="preserve">Intelligent IoT Poultry System for Automated Feed and Environmental Monitoring. 2025.</w:t>
+      </w:r>
+    </w:p>
+    <w:p>
+      <w:pPr>
+        <w:spacing w:after="140" w:line="300"/>
+        <w:ind w:left="480" w:hanging="480"/>
+        <w:jc w:val="both"/>
+      </w:pPr>
+      <w:r>
+        <w:rPr>
+          <w:rFonts w:ascii="Times New Roman" w:cs="Times New Roman" w:eastAsia="Times New Roman" w:hAnsi="Times New Roman"/>
+          <w:sz w:val="22"/>
+          <w:szCs w:val="22"/>
+        </w:rPr>
+        <w:t xml:space="preserve">An IoT-Based System for Measuring Diurnal Gas Emissions. 2025.</w:t>
+      </w:r>
+    </w:p>
+    <w:p>
+      <w:pPr>
+        <w:spacing w:after="140" w:line="300"/>
+        <w:ind w:left="480" w:hanging="480"/>
+        <w:jc w:val="both"/>
+      </w:pPr>
+      <w:r>
+        <w:rPr>
+          <w:rFonts w:ascii="Times New Roman" w:cs="Times New Roman" w:eastAsia="Times New Roman" w:hAnsi="Times New Roman"/>
+          <w:sz w:val="22"/>
+          <w:szCs w:val="22"/>
+        </w:rPr>
+        <w:t xml:space="preserve">Proposing A Cloud and Edge Computing Based Decision Supportive Consolidated Farming System. International Conference on Emerging Smart Computing and Informatics (ESCI), 2026.</w:t>
+      </w:r>
+    </w:p>
+    <w:p>
+      <w:pPr>
+        <w:spacing w:after="140" w:line="300"/>
+        <w:ind w:left="480" w:hanging="480"/>
+        <w:jc w:val="both"/>
+      </w:pPr>
+      <w:r>
+        <w:rPr>
+          <w:rFonts w:ascii="Times New Roman" w:cs="Times New Roman" w:eastAsia="Times New Roman" w:hAnsi="Times New Roman"/>
+          <w:sz w:val="22"/>
+          <w:szCs w:val="22"/>
+        </w:rPr>
+        <w:t xml:space="preserve">5G Enabled Agriculture Ecosystem: Food Supply Chain, Rural Development, and Climate Resilience. 2026.</w:t>
+      </w:r>
+    </w:p>
+    <w:p>
+      <w:pPr>
+        <w:pStyle w:val="Heading3"/>
+        <w:spacing w:after="140" w:before="260"/>
+      </w:pPr>
+      <w:r>
+        <w:rPr>
+          <w:rFonts w:ascii="Times New Roman" w:cs="Times New Roman" w:eastAsia="Times New Roman" w:hAnsi="Times New Roman"/>
+          <w:b/>
+          <w:bCs/>
+          <w:sz w:val="24"/>
+          <w:szCs w:val="24"/>
+        </w:rPr>
+        <w:t xml:space="preserve">Edge, fog and serverless computing</w:t>
+      </w:r>
+    </w:p>
+    <w:p>
+      <w:pPr>
+        <w:spacing w:after="140" w:line="300"/>
+        <w:ind w:left="480" w:hanging="480"/>
+        <w:jc w:val="both"/>
+      </w:pPr>
+      <w:r>
+        <w:rPr>
+          <w:rFonts w:ascii="Times New Roman" w:cs="Times New Roman" w:eastAsia="Times New Roman" w:hAnsi="Times New Roman"/>
+          <w:sz w:val="22"/>
+          <w:szCs w:val="22"/>
+        </w:rPr>
+        <w:t xml:space="preserve">The computing continuum: Past, present, and future. Computer Science Review, vol. 58, 2025.</w:t>
+      </w:r>
+    </w:p>
+    <w:p>
+      <w:pPr>
+        <w:spacing w:after="140" w:line="300"/>
+        <w:ind w:left="480" w:hanging="480"/>
+        <w:jc w:val="both"/>
+      </w:pPr>
+      <w:r>
+        <w:rPr>
+          <w:rFonts w:ascii="Times New Roman" w:cs="Times New Roman" w:eastAsia="Times New Roman" w:hAnsi="Times New Roman"/>
+          <w:sz w:val="22"/>
+          <w:szCs w:val="22"/>
+        </w:rPr>
+        <w:t xml:space="preserve">Contemporary advances in multi-access edge computing: A survey of fundamentals, architecture, technologies. Journal of Network and Computer Applications, vol. 248, 2026.</w:t>
+      </w:r>
+    </w:p>
+    <w:p>
+      <w:pPr>
+        <w:spacing w:after="140" w:line="300"/>
+        <w:ind w:left="480" w:hanging="480"/>
+        <w:jc w:val="both"/>
+      </w:pPr>
+      <w:r>
+        <w:rPr>
+          <w:rFonts w:ascii="Times New Roman" w:cs="Times New Roman" w:eastAsia="Times New Roman" w:hAnsi="Times New Roman"/>
+          <w:sz w:val="22"/>
+          <w:szCs w:val="22"/>
+        </w:rPr>
+        <w:t xml:space="preserve">Microservices and serverless functions — lifecycle, performance, and resource utilisation of edge based systems. Future Generation Computer Systems, vol. 150, 2024.</w:t>
+      </w:r>
+    </w:p>
+    <w:p>
+      <w:pPr>
+        <w:spacing w:after="140" w:line="300"/>
+        <w:ind w:left="480" w:hanging="480"/>
+        <w:jc w:val="both"/>
+      </w:pPr>
+      <w:r>
+        <w:rPr>
+          <w:rFonts w:ascii="Times New Roman" w:cs="Times New Roman" w:eastAsia="Times New Roman" w:hAnsi="Times New Roman"/>
+          <w:sz w:val="22"/>
+          <w:szCs w:val="22"/>
+        </w:rPr>
+        <w:t xml:space="preserve">Expanding the cloud-to-edge continuum to the IoT in serverless federated learning. Future Generation Computer Systems, vol. 155, 2024.</w:t>
+      </w:r>
+    </w:p>
+    <w:p>
+      <w:pPr>
+        <w:spacing w:after="140" w:line="300"/>
+        <w:ind w:left="480" w:hanging="480"/>
+        <w:jc w:val="both"/>
+      </w:pPr>
+      <w:r>
+        <w:rPr>
+          <w:rFonts w:ascii="Times New Roman" w:cs="Times New Roman" w:eastAsia="Times New Roman" w:hAnsi="Times New Roman"/>
+          <w:sz w:val="22"/>
+          <w:szCs w:val="22"/>
+        </w:rPr>
+        <w:t xml:space="preserve">AI augmented Edge and Fog computing: Trends and challenges. Journal of Network and Computer Applications, vol. 216, 2023.</w:t>
+      </w:r>
+    </w:p>
+    <w:p>
+      <w:pPr>
+        <w:spacing w:after="140" w:line="300"/>
+        <w:ind w:left="480" w:hanging="480"/>
+        <w:jc w:val="both"/>
+      </w:pPr>
+      <w:r>
+        <w:rPr>
+          <w:rFonts w:ascii="Times New Roman" w:cs="Times New Roman" w:eastAsia="Times New Roman" w:hAnsi="Times New Roman"/>
+          <w:sz w:val="22"/>
+          <w:szCs w:val="22"/>
+        </w:rPr>
+        <w:t xml:space="preserve">Edge-AI empowered Cyber-Physical Systems: A comprehensive review on performance analysis. Computer Science Review, vol. 58, 2025.</w:t>
+      </w:r>
+    </w:p>
+    <w:p>
+      <w:pPr>
+        <w:spacing w:after="140" w:line="300"/>
+        <w:ind w:left="480" w:hanging="480"/>
+        <w:jc w:val="both"/>
+      </w:pPr>
+      <w:r>
+        <w:rPr>
+          <w:rFonts w:ascii="Times New Roman" w:cs="Times New Roman" w:eastAsia="Times New Roman" w:hAnsi="Times New Roman"/>
+          <w:sz w:val="22"/>
+          <w:szCs w:val="22"/>
+        </w:rPr>
+        <w:t xml:space="preserve">Revisiting workflow scheduling with the power of edge computing: Taxonomy, review, and open challenges. Computer Science Review, vol. 60, 2026.</w:t>
+      </w:r>
+    </w:p>
+    <w:p>
+      <w:pPr>
+        <w:spacing w:after="140" w:line="300"/>
+        <w:ind w:left="480" w:hanging="480"/>
+        <w:jc w:val="both"/>
+      </w:pPr>
+      <w:r>
+        <w:rPr>
+          <w:rFonts w:ascii="Times New Roman" w:cs="Times New Roman" w:eastAsia="Times New Roman" w:hAnsi="Times New Roman"/>
+          <w:sz w:val="22"/>
+          <w:szCs w:val="22"/>
+        </w:rPr>
+        <w:t xml:space="preserve">Edge or Cloud Architecture: The Applicability of New Data Processing. 2025.</w:t>
+      </w:r>
+    </w:p>
+    <w:p>
+      <w:pPr>
+        <w:spacing w:after="140" w:line="300"/>
+        <w:ind w:left="480" w:hanging="480"/>
+        <w:jc w:val="both"/>
+      </w:pPr>
+      <w:r>
+        <w:rPr>
+          <w:rFonts w:ascii="Times New Roman" w:cs="Times New Roman" w:eastAsia="Times New Roman" w:hAnsi="Times New Roman"/>
+          <w:sz w:val="22"/>
+          <w:szCs w:val="22"/>
+        </w:rPr>
+        <w:t xml:space="preserve">Serverless Blockchain-Enabled Architecture for IoT Societal Applications. IEEE, 2020.</w:t>
+      </w:r>
+    </w:p>
+    <w:p>
+      <w:pPr>
+        <w:pStyle w:val="Heading3"/>
+        <w:spacing w:after="140" w:before="260"/>
+      </w:pPr>
+      <w:r>
+        <w:rPr>
+          <w:rFonts w:ascii="Times New Roman" w:cs="Times New Roman" w:eastAsia="Times New Roman" w:hAnsi="Times New Roman"/>
+          <w:b/>
+          <w:bCs/>
+          <w:sz w:val="24"/>
+          <w:szCs w:val="24"/>
+        </w:rPr>
+        <w:t xml:space="preserve">Security, integrity and standards</w:t>
+      </w:r>
+    </w:p>
+    <w:p>
+      <w:pPr>
+        <w:spacing w:after="140" w:line="300"/>
+        <w:ind w:left="480" w:hanging="480"/>
+        <w:jc w:val="both"/>
+      </w:pPr>
+      <w:r>
+        <w:rPr>
+          <w:rFonts w:ascii="Times New Roman" w:cs="Times New Roman" w:eastAsia="Times New Roman" w:hAnsi="Times New Roman"/>
+          <w:sz w:val="22"/>
+          <w:szCs w:val="22"/>
+        </w:rPr>
+        <w:t xml:space="preserve">Exploring the integration of edge computing and blockchain IoT: Principles, architectures, security, and applications. Journal of Network and Computer Applications, vol. 226, 2024.</w:t>
+      </w:r>
+    </w:p>
+    <w:p>
+      <w:pPr>
+        <w:spacing w:after="140" w:line="300"/>
+        <w:ind w:left="480" w:hanging="480"/>
+        <w:jc w:val="both"/>
+      </w:pPr>
+      <w:r>
+        <w:rPr>
+          <w:rFonts w:ascii="Times New Roman" w:cs="Times New Roman" w:eastAsia="Times New Roman" w:hAnsi="Times New Roman"/>
+          <w:sz w:val="22"/>
+          <w:szCs w:val="22"/>
+        </w:rPr>
+        <w:t xml:space="preserve">Security and privacy of industrial big data: Motivation, opportunities, and challenges. Computer Science Review, vol. 58, 2025.</w:t>
+      </w:r>
+    </w:p>
+    <w:p>
+      <w:pPr>
+        <w:spacing w:after="140" w:line="300"/>
+        <w:ind w:left="480" w:hanging="480"/>
+        <w:jc w:val="both"/>
+      </w:pPr>
+      <w:r>
+        <w:rPr>
+          <w:rFonts w:ascii="Times New Roman" w:cs="Times New Roman" w:eastAsia="Times New Roman" w:hAnsi="Times New Roman"/>
+          <w:sz w:val="22"/>
+          <w:szCs w:val="22"/>
+        </w:rPr>
+        <w:t xml:space="preserve">A multi-objectives framework for secure blockchain in fog–cloud network. Future Generation Computer Systems, vol. 155, 2024.</w:t>
+      </w:r>
+    </w:p>
+    <w:p>
+      <w:pPr>
+        <w:spacing w:after="140" w:line="300"/>
+        <w:ind w:left="480" w:hanging="480"/>
+        <w:jc w:val="both"/>
+      </w:pPr>
+      <w:r>
+        <w:rPr>
+          <w:rFonts w:ascii="Times New Roman" w:cs="Times New Roman" w:eastAsia="Times New Roman" w:hAnsi="Times New Roman"/>
+          <w:sz w:val="22"/>
+          <w:szCs w:val="22"/>
+        </w:rPr>
+        <w:t xml:space="preserve">IEEE Std 2796-2024, IEEE Standard for Framework for the Internet of Food (IoF). IEEE, 2024.</w:t>
+      </w:r>
+    </w:p>
+    <w:p>
+      <w:pPr>
+        <w:spacing w:after="140" w:line="300"/>
+        <w:ind w:left="480" w:hanging="480"/>
+        <w:jc w:val="both"/>
+      </w:pPr>
+      <w:r>
+        <w:rPr>
+          <w:rFonts w:ascii="Times New Roman" w:cs="Times New Roman" w:eastAsia="Times New Roman" w:hAnsi="Times New Roman"/>
+          <w:sz w:val="22"/>
+          <w:szCs w:val="22"/>
+        </w:rPr>
+        <w:t xml:space="preserve">IEEE Std 2992-2025, IEEE Recommended Practice for Data Expression, Exchange, and Processing in Smart Agriculture. IEEE, 2025.</w:t>
+      </w:r>
+    </w:p>
+    <w:p>
+      <w:pPr>
+        <w:pStyle w:val="Heading3"/>
+        <w:spacing w:after="140" w:before="260"/>
+      </w:pPr>
+      <w:r>
+        <w:rPr>
+          <w:rFonts w:ascii="Times New Roman" w:cs="Times New Roman" w:eastAsia="Times New Roman" w:hAnsi="Times New Roman"/>
+          <w:b/>
+          <w:bCs/>
+          <w:sz w:val="24"/>
+          <w:szCs w:val="24"/>
+        </w:rPr>
+        <w:t xml:space="preserve">Machine learning and forecasting</w:t>
+      </w:r>
+    </w:p>
+    <w:p>
+      <w:pPr>
+        <w:spacing w:after="140" w:line="300"/>
+        <w:ind w:left="480" w:hanging="480"/>
+        <w:jc w:val="both"/>
+      </w:pPr>
+      <w:r>
+        <w:rPr>
+          <w:rFonts w:ascii="Times New Roman" w:cs="Times New Roman" w:eastAsia="Times New Roman" w:hAnsi="Times New Roman"/>
+          <w:sz w:val="22"/>
+          <w:szCs w:val="22"/>
+        </w:rPr>
+        <w:t xml:space="preserve">A survey on machine learning for streaming time series forecasting. Computer Science Review, vol. 62, 2026.</w:t>
+      </w:r>
+    </w:p>
+    <w:p>
+      <w:pPr>
+        <w:spacing w:after="140" w:line="300"/>
+        <w:ind w:left="480" w:hanging="480"/>
+        <w:jc w:val="both"/>
+      </w:pPr>
+      <w:r>
+        <w:rPr>
+          <w:rFonts w:ascii="Times New Roman" w:cs="Times New Roman" w:eastAsia="Times New Roman" w:hAnsi="Times New Roman"/>
+          <w:sz w:val="22"/>
+          <w:szCs w:val="22"/>
+        </w:rPr>
+        <w:t xml:space="preserve">Explainable AI with SHAP for Data-Driven Growth Prediction in Smart Poultry Farming. 2025.</w:t>
+      </w:r>
+    </w:p>
+    <w:p>
+      <w:pPr>
+        <w:spacing w:after="140" w:line="300"/>
+        <w:ind w:left="480" w:hanging="480"/>
+        <w:jc w:val="both"/>
+      </w:pPr>
+      <w:r>
+        <w:rPr>
+          <w:rFonts w:ascii="Times New Roman" w:cs="Times New Roman" w:eastAsia="Times New Roman" w:hAnsi="Times New Roman"/>
+          <w:sz w:val="22"/>
+          <w:szCs w:val="22"/>
+        </w:rPr>
+        <w:t xml:space="preserve">IoT based Poultry Farm Monitoring System with Deep Learning Techniques. 2026.</w:t>
+      </w:r>
+    </w:p>
+    <w:p>
+      <w:pPr>
+        <w:spacing w:after="140" w:line="300"/>
+        <w:ind w:left="480" w:hanging="480"/>
+        <w:jc w:val="both"/>
+      </w:pPr>
+      <w:r>
+        <w:rPr>
+          <w:rFonts w:ascii="Times New Roman" w:cs="Times New Roman" w:eastAsia="Times New Roman" w:hAnsi="Times New Roman"/>
+          <w:sz w:val="22"/>
+          <w:szCs w:val="22"/>
+        </w:rPr>
+        <w:t xml:space="preserve">Intelligent Control Shed Poultry Farm System Incorporating With Machine Learning. 2024.</w:t>
+      </w:r>
+    </w:p>
+    <w:p>
+      <w:pPr>
+        <w:spacing w:after="140" w:line="300"/>
+        <w:ind w:left="480" w:hanging="480"/>
+        <w:jc w:val="both"/>
+      </w:pPr>
+      <w:r>
+        <w:rPr>
+          <w:rFonts w:ascii="Times New Roman" w:cs="Times New Roman" w:eastAsia="Times New Roman" w:hAnsi="Times New Roman"/>
+          <w:sz w:val="22"/>
+          <w:szCs w:val="22"/>
+        </w:rPr>
+        <w:t xml:space="preserve">Optimizing Poultry Farming Through Environmental Data Analytics Using IoT and ERP Systems. 2026.</w:t>
+      </w:r>
+    </w:p>
+    <w:p>
+      <w:pPr>
+        <w:spacing w:after="140" w:line="300"/>
+        <w:ind w:left="480" w:hanging="480"/>
+        <w:jc w:val="both"/>
+      </w:pPr>
+      <w:r>
+        <w:rPr>
+          <w:rFonts w:ascii="Times New Roman" w:cs="Times New Roman" w:eastAsia="Times New Roman" w:hAnsi="Times New Roman"/>
+          <w:sz w:val="22"/>
+          <w:szCs w:val="22"/>
+        </w:rPr>
+        <w:t xml:space="preserve">Data drift-resilient inference: Maintaining model integrity via lightweight distribution correction. Future Generation Computer Systems, vol. 184, 2026.</w:t>
+      </w:r>
+    </w:p>
+    <w:p>
+      <w:pPr>
+        <w:spacing w:before="300"/>
+      </w:pPr>
+    </w:p>
+    <w:p>
+      <w:pPr>
+        <w:spacing w:after="200" w:line="360"/>
+        <w:jc w:val="both"/>
+      </w:pPr>
+      <w:r>
+        <w:rPr>
+          <w:rFonts w:ascii="Times New Roman" w:cs="Times New Roman" w:eastAsia="Times New Roman" w:hAnsi="Times New Roman"/>
+          <w:color w:val="5A5A5A"/>
+          <w:sz w:val="21"/>
+          <w:szCs w:val="21"/>
+        </w:rPr>
+        <w:t xml:space="preserve">A further 30 sources from the corpus, addressing adjacent topics in IoT architecture, scheduling, networking and smart cities, were examined but are not cited above as they do not bear directly on the design decisions discussed in this chapter. They remain available in the project source collection.</w:t>
       </w:r>
     </w:p>
     <w:p>

</xml_diff>